<commit_message>
Q3: fill in padlet URL in reference [1]
Co-Authored-By: Claude Opus 5.5 <noreply@anthropic.com>
Claude-Session: https://claude.ai/code/session_01S9UsWNvmNdPnPBZTsuhRaY
</commit_message>
<xml_diff>
--- a/CO3101-CW1/CW1-Question3.docx
+++ b/CO3101-CW1/CW1-Question3.docx
@@ -920,37 +920,7 @@
           <w:sz w:val="19"/>
           <w:szCs w:val="19"/>
         </w:rPr>
-        <w:t xml:space="preserve">[1] </w:t>
-      </w:r>
-      <w:r>
-        <w:rPr>
-          <w:sz w:val="19"/>
-          <w:szCs w:val="19"/>
-          <w:highlight w:val="yellow"/>
-        </w:rPr>
-        <w:t xml:space="preserve">[Group name / module team]</w:t>
-      </w:r>
-      <w:r>
-        <w:rPr>
-          <w:sz w:val="19"/>
-          <w:szCs w:val="19"/>
-        </w:rPr>
-        <w:t xml:space="preserve">, “CO3101 Inclusive approach to software engineering,” Padlet, 2026. [Online]. Available: </w:t>
-      </w:r>
-      <w:r>
-        <w:rPr>
-          <w:sz w:val="19"/>
-          <w:szCs w:val="19"/>
-          <w:highlight w:val="yellow"/>
-        </w:rPr>
-        <w:t xml:space="preserve">[padlet URL]</w:t>
-      </w:r>
-      <w:r>
-        <w:rPr>
-          <w:sz w:val="19"/>
-          <w:szCs w:val="19"/>
-        </w:rPr>
-        <w:t xml:space="preserve">. [Accessed: </w:t>
+        <w:t xml:space="preserve">[1] J. Hoey, “Inclusive approach to software engineering: The impacts on people, society, businesses,” Padlet, CO3101 Lecture 5, 2026. [Online]. Available: https://padlet.com/jameshoey/cw1q3. [Accessed: </w:t>
       </w:r>
       <w:r>
         <w:rPr>

</xml_diff>

<commit_message>
Q3: rewrite with real padlet themes, quotes and gap counts; add Copilot-ready post list
Co-Authored-By: Claude Opus 5.5 <noreply@anthropic.com>
Claude-Session: https://claude.ai/code/session_01S9UsWNvmNdPnPBZTsuhRaY
</commit_message>
<xml_diff>
--- a/CO3101-CW1/CW1-Question3.docx
+++ b/CO3101-CW1/CW1-Question3.docx
@@ -165,7 +165,7 @@
                 <wp:positionV relativeFrom="margin">
                   <wp:posOffset>600000</wp:posOffset>
                 </wp:positionV>
-                <wp:extent cx="6527165" cy="3450000"/>
+                <wp:extent cx="6527165" cy="3300000"/>
                 <wp:effectExtent l="0" t="0" r="0" b="0"/>
                 <wp:wrapSquare wrapText="bothSides"/>
                 <wp:docPr id="901" name="Figure 1 901"/>
@@ -177,7 +177,7 @@
                       <wps:spPr>
                         <a:xfrm>
                           <a:off x="0" y="0"/>
-                          <a:ext cx="6527165" cy="3450000"/>
+                          <a:ext cx="6527165" cy="3300000"/>
                         </a:xfrm>
                         <a:prstGeom prst="rect">
                           <a:avLst/>
@@ -204,7 +204,7 @@
                                 <w:szCs w:val="20"/>
                                 <w:highlight w:val="yellow"/>
                               </w:rPr>
-                              <w:t xml:space="preserve">[INSERT FIGURE 1 HERE: the mind map Copilot produced from the padlet posts. Delete this box text and paste the image (Insert &gt; Picture), sized to fill this box]</w:t>
+                              <w:t xml:space="preserve">[INSERT FIGURE 1 HERE: the mind map Copilot produced from the 45 padlet posts, after you have checked and corrected it. Delete this box text and paste the image (Insert &gt; Picture), sized to fill this box]</w:t>
                             </w:r>
                           </w:p>
                         </w:txbxContent>
@@ -233,7 +233,7 @@
                   <wp:posOffset>3443605</wp:posOffset>
                 </wp:positionH>
                 <wp:positionV relativeFrom="margin">
-                  <wp:posOffset>4080000</wp:posOffset>
+                  <wp:posOffset>3920000</wp:posOffset>
                 </wp:positionV>
                 <wp:extent cx="6527165" cy="300000"/>
                 <wp:effectExtent l="0" t="0" r="0" b="0"/>
@@ -282,7 +282,7 @@
                                 <w:sz w:val="18"/>
                                 <w:szCs w:val="18"/>
                               </w:rPr>
-                              <w:t xml:space="preserve">Copilot-generated mind map of padlet themes, checked and corrected by us [1], [2].</w:t>
+                              <w:t xml:space="preserve">Copilot-generated mind map of the 45 padlet posts [1], checked and corrected by us [5].</w:t>
                             </w:r>
                           </w:p>
                         </w:txbxContent>
@@ -311,9 +311,9 @@
                   <wp:posOffset>3443605</wp:posOffset>
                 </wp:positionH>
                 <wp:positionV relativeFrom="margin">
-                  <wp:posOffset>4500000</wp:posOffset>
+                  <wp:posOffset>4300000</wp:posOffset>
                 </wp:positionV>
-                <wp:extent cx="3083560" cy="820000"/>
+                <wp:extent cx="3083560" cy="900000"/>
                 <wp:effectExtent l="0" t="0" r="0" b="0"/>
                 <wp:wrapSquare wrapText="bothSides"/>
                 <wp:docPr id="903" name="Quote 903"/>
@@ -325,7 +325,7 @@
                       <wps:spPr>
                         <a:xfrm>
                           <a:off x="0" y="0"/>
-                          <a:ext cx="3083560" cy="820000"/>
+                          <a:ext cx="3083560" cy="900000"/>
                         </a:xfrm>
                         <a:prstGeom prst="rect">
                           <a:avLst/>
@@ -348,32 +348,17 @@
                             </w:pPr>
                             <w:r>
                               <w:rPr>
-                                <w:sz w:val="30"/>
-                                <w:szCs w:val="30"/>
-                              </w:rPr>
-                              <w:t xml:space="preserve">“</w:t>
-                            </w:r>
-                            <w:r>
-                              <w:rPr>
-                                <w:sz w:val="26"/>
-                                <w:szCs w:val="26"/>
-                                <w:highlight w:val="yellow"/>
-                              </w:rPr>
-                              <w:t xml:space="preserve">[most representative padlet post, quoted word-for-word]</w:t>
-                            </w:r>
-                            <w:r>
-                              <w:rPr>
-                                <w:sz w:val="30"/>
-                                <w:szCs w:val="30"/>
-                              </w:rPr>
-                              <w:t xml:space="preserve">” </w:t>
-                            </w:r>
-                            <w:r>
-                              <w:rPr>
-                                <w:sz w:val="20"/>
-                                <w:szCs w:val="20"/>
-                              </w:rPr>
-                              <w:t xml:space="preserve">[1]</w:t>
+                                <w:sz w:val="22"/>
+                                <w:szCs w:val="22"/>
+                              </w:rPr>
+                              <w:t xml:space="preserve">“there will almost always be someone who could be affected by the software negatively on the team” </w:t>
+                            </w:r>
+                            <w:r>
+                              <w:rPr>
+                                <w:sz w:val="18"/>
+                                <w:szCs w:val="18"/>
+                              </w:rPr>
+                              <w:t xml:space="preserve">– P32 [1]</w:t>
                             </w:r>
                           </w:p>
                         </w:txbxContent>
@@ -402,9 +387,9 @@
                   <wp:posOffset>3443605</wp:posOffset>
                 </wp:positionH>
                 <wp:positionV relativeFrom="margin">
-                  <wp:posOffset>5430000</wp:posOffset>
+                  <wp:posOffset>5300000</wp:posOffset>
                 </wp:positionV>
-                <wp:extent cx="3083560" cy="1480000"/>
+                <wp:extent cx="3083560" cy="1650000"/>
                 <wp:effectExtent l="0" t="0" r="0" b="0"/>
                 <wp:wrapSquare wrapText="bothSides"/>
                 <wp:docPr id="904" name="Figure 2 904"/>
@@ -416,7 +401,7 @@
                       <wps:spPr>
                         <a:xfrm>
                           <a:off x="0" y="0"/>
-                          <a:ext cx="3083560" cy="1480000"/>
+                          <a:ext cx="3083560" cy="1650000"/>
                         </a:xfrm>
                         <a:prstGeom prst="rect">
                           <a:avLst/>
@@ -434,17 +419,97 @@
                         <w:txbxContent>
                           <w:p>
                             <w:pPr>
-                              <w:spacing w:after="60" w:line="240" w:lineRule="auto"/>
+                              <w:spacing w:after="50" w:line="240" w:lineRule="auto"/>
                               <w:jc w:val="left"/>
                             </w:pPr>
                             <w:r>
                               <w:rPr>
                                 <w:b/>
                                 <w:bCs/>
-                                <w:sz w:val="20"/>
-                                <w:szCs w:val="20"/>
-                              </w:rPr>
-                              <w:t xml:space="preserve">Checking the AI output</w:t>
+                                <w:sz w:val="19"/>
+                                <w:szCs w:val="19"/>
+                              </w:rPr>
+                              <w:t xml:space="preserve">Figure 2: Checking the AI</w:t>
+                            </w:r>
+                          </w:p>
+                          <w:p>
+                            <w:pPr>
+                              <w:spacing w:after="20" w:line="240" w:lineRule="auto"/>
+                              <w:jc w:val="left"/>
+                            </w:pPr>
+                            <w:r>
+                              <w:rPr>
+                                <w:b/>
+                                <w:bCs/>
+                                <w:sz w:val="17"/>
+                                <w:szCs w:val="17"/>
+                              </w:rPr>
+                              <w:t xml:space="preserve">Theme (posts in our manual check):</w:t>
+                            </w:r>
+                          </w:p>
+                          <w:p>
+                            <w:pPr>
+                              <w:spacing w:after="10" w:line="240" w:lineRule="auto"/>
+                              <w:jc w:val="left"/>
+                            </w:pPr>
+                            <w:r>
+                              <w:rPr>
+                                <w:sz w:val="17"/>
+                                <w:szCs w:val="17"/>
+                              </w:rPr>
+                              <w:t xml:space="preserve">• Diverse perspectives &amp; teamwork – 11</w:t>
+                            </w:r>
+                          </w:p>
+                          <w:p>
+                            <w:pPr>
+                              <w:spacing w:after="10" w:line="240" w:lineRule="auto"/>
+                              <w:jc w:val="left"/>
+                            </w:pPr>
+                            <w:r>
+                              <w:rPr>
+                                <w:sz w:val="17"/>
+                                <w:szCs w:val="17"/>
+                              </w:rPr>
+                              <w:t xml:space="preserve">• Reducing bias &amp; improving quality – 10</w:t>
+                            </w:r>
+                          </w:p>
+                          <w:p>
+                            <w:pPr>
+                              <w:spacing w:after="10" w:line="240" w:lineRule="auto"/>
+                              <w:jc w:val="left"/>
+                            </w:pPr>
+                            <w:r>
+                              <w:rPr>
+                                <w:sz w:val="17"/>
+                                <w:szCs w:val="17"/>
+                              </w:rPr>
+                              <w:t xml:space="preserve">• Accessibility &amp; understanding users – 9</w:t>
+                            </w:r>
+                          </w:p>
+                          <w:p>
+                            <w:pPr>
+                              <w:spacing w:after="10" w:line="240" w:lineRule="auto"/>
+                              <w:jc w:val="left"/>
+                            </w:pPr>
+                            <w:r>
+                              <w:rPr>
+                                <w:sz w:val="17"/>
+                                <w:szCs w:val="17"/>
+                              </w:rPr>
+                              <w:t xml:space="preserve">• Business &amp; society – 8</w:t>
+                            </w:r>
+                          </w:p>
+                          <w:p>
+                            <w:pPr>
+                              <w:spacing w:after="10" w:line="240" w:lineRule="auto"/>
+                              <w:jc w:val="left"/>
+                            </w:pPr>
+                            <w:r>
+                              <w:rPr>
+                                <w:sz w:val="17"/>
+                                <w:szCs w:val="17"/>
+                              </w:rPr>
+                              <w:t xml:space="preserve">• Limits &amp; conditions – 7</w:t>
                             </w:r>
                           </w:p>
                           <w:p>
@@ -454,11 +519,33 @@
                             </w:pPr>
                             <w:r>
                               <w:rPr>
-                                <w:sz w:val="18"/>
-                                <w:szCs w:val="18"/>
+                                <w:sz w:val="17"/>
+                                <w:szCs w:val="17"/>
+                              </w:rPr>
+                              <w:t xml:space="preserve">Copilot’s first count: </w:t>
+                            </w:r>
+                            <w:r>
+                              <w:rPr>
+                                <w:sz w:val="17"/>
+                                <w:szCs w:val="17"/>
                                 <w:highlight w:val="yellow"/>
                               </w:rPr>
-                              <w:t xml:space="preserve">[INSERT FIGURE 2: screenshot of your follow-up Copilot prompt(s), or a mini table: Theme | posts per Copilot | posts after our check]</w:t>
+                              <w:t xml:space="preserve">[fill in, e.g. 4 themes, 41 posts]</w:t>
+                            </w:r>
+                            <w:r>
+                              <w:rPr>
+                                <w:sz w:val="17"/>
+                                <w:szCs w:val="17"/>
+                              </w:rPr>
+                              <w:t xml:space="preserve">. Corrections made: </w:t>
+                            </w:r>
+                            <w:r>
+                              <w:rPr>
+                                <w:sz w:val="17"/>
+                                <w:szCs w:val="17"/>
+                                <w:highlight w:val="yellow"/>
+                              </w:rPr>
+                              <w:t xml:space="preserve">[e.g. P8, P31 moved]</w:t>
                             </w:r>
                           </w:p>
                         </w:txbxContent>
@@ -487,9 +574,9 @@
                   <wp:posOffset>6887210</wp:posOffset>
                 </wp:positionH>
                 <wp:positionV relativeFrom="margin">
-                  <wp:posOffset>4500000</wp:posOffset>
+                  <wp:posOffset>4300000</wp:posOffset>
                 </wp:positionV>
-                <wp:extent cx="3083560" cy="2410000"/>
+                <wp:extent cx="3083560" cy="2650000"/>
                 <wp:effectExtent l="0" t="0" r="0" b="0"/>
                 <wp:wrapSquare wrapText="bothSides"/>
                 <wp:docPr id="905" name="Missing 905"/>
@@ -501,7 +588,7 @@
                       <wps:spPr>
                         <a:xfrm>
                           <a:off x="0" y="0"/>
-                          <a:ext cx="3083560" cy="2410000"/>
+                          <a:ext cx="3083560" cy="2650000"/>
                         </a:xfrm>
                         <a:prstGeom prst="rect">
                           <a:avLst/>
@@ -545,22 +632,7 @@
                                 <w:sz w:val="18"/>
                                 <w:szCs w:val="18"/>
                               </w:rPr>
-                              <w:t xml:space="preserve">Under- or not represented </w:t>
-                            </w:r>
-                            <w:r>
-                              <w:rPr>
-                                <w:sz w:val="18"/>
-                                <w:szCs w:val="18"/>
-                                <w:highlight w:val="yellow"/>
-                              </w:rPr>
-                              <w:t xml:space="preserve">[tick only those that really are missing]</w:t>
-                            </w:r>
-                            <w:r>
-                              <w:rPr>
-                                <w:sz w:val="18"/>
-                                <w:szCs w:val="18"/>
-                              </w:rPr>
-                              <w:t xml:space="preserve">:</w:t>
+                              <w:t xml:space="preserve">Posts naming each group (of 45):</w:t>
                             </w:r>
                           </w:p>
                           <w:p>
@@ -573,7 +645,7 @@
                                 <w:sz w:val="18"/>
                                 <w:szCs w:val="18"/>
                               </w:rPr>
-                              <w:t xml:space="preserve">• Neurodivergent users (autism, ADHD, dyslexia)</w:t>
+                              <w:t xml:space="preserve">• Disabled people – 1 (P3)</w:t>
                             </w:r>
                           </w:p>
                           <w:p>
@@ -586,7 +658,7 @@
                                 <w:sz w:val="18"/>
                                 <w:szCs w:val="18"/>
                               </w:rPr>
-                              <w:t xml:space="preserve">• LGBTQ+ users and non-binary gender data</w:t>
+                              <w:t xml:space="preserve">• Women / gender – 1 (P12, “a pregnant woman”)</w:t>
                             </w:r>
                           </w:p>
                           <w:p>
@@ -599,7 +671,33 @@
                                 <w:sz w:val="18"/>
                                 <w:szCs w:val="18"/>
                               </w:rPr>
-                              <w:t xml:space="preserve">• Non-English speakers and low-literacy users</w:t>
+                              <w:t xml:space="preserve">• Low-income users – 1 (P18, “digital divide”)</w:t>
+                            </w:r>
+                          </w:p>
+                          <w:p>
+                            <w:pPr>
+                              <w:spacing w:after="20" w:line="240" w:lineRule="auto"/>
+                              <w:jc w:val="left"/>
+                            </w:pPr>
+                            <w:r>
+                              <w:rPr>
+                                <w:sz w:val="18"/>
+                                <w:szCs w:val="18"/>
+                              </w:rPr>
+                              <w:t xml:space="preserve">• Older users – 0</w:t>
+                            </w:r>
+                          </w:p>
+                          <w:p>
+                            <w:pPr>
+                              <w:spacing w:after="20" w:line="240" w:lineRule="auto"/>
+                              <w:jc w:val="left"/>
+                            </w:pPr>
+                            <w:r>
+                              <w:rPr>
+                                <w:sz w:val="18"/>
+                                <w:szCs w:val="18"/>
+                              </w:rPr>
+                              <w:t xml:space="preserve">• Neurodivergent users – 0</w:t>
                             </w:r>
                           </w:p>
                           <w:p>
@@ -612,12 +710,12 @@
                                 <w:sz w:val="18"/>
                                 <w:szCs w:val="18"/>
                               </w:rPr>
-                              <w:t xml:space="preserve">• Rural / low-bandwidth / low-cost-device users</w:t>
+                              <w:t xml:space="preserve">• LGBTQ+ users – 0</w:t>
                             </w:r>
                           </w:p>
                           <w:p>
                             <w:pPr>
-                              <w:spacing w:after="80" w:line="240" w:lineRule="auto"/>
+                              <w:spacing w:after="60" w:line="240" w:lineRule="auto"/>
                               <w:jc w:val="left"/>
                             </w:pPr>
                             <w:r>
@@ -634,15 +732,29 @@
                                 <w:sz w:val="18"/>
                                 <w:szCs w:val="18"/>
                               </w:rPr>
-                              <w:t xml:space="preserve">accessibility for visually impaired users </w:t>
-                            </w:r>
-                            <w:r>
-                              <w:rPr>
+                              <w:t xml:space="preserve">“more viewpoints / ideas” – 11 posts, many only 1–3 words</w:t>
+                            </w:r>
+                          </w:p>
+                          <w:p>
+                            <w:pPr>
+                              <w:spacing w:after="60" w:line="240" w:lineRule="auto"/>
+                              <w:jc w:val="left"/>
+                            </w:pPr>
+                            <w:r>
+                              <w:rPr>
+                                <w:b/>
+                                <w:bCs/>
                                 <w:sz w:val="18"/>
                                 <w:szCs w:val="18"/>
-                                <w:highlight w:val="yellow"/>
-                              </w:rPr>
-                              <w:t xml:space="preserve">[confirm]</w:t>
+                              </w:rPr>
+                              <w:t xml:space="preserve">Critical or cautious posts: </w:t>
+                            </w:r>
+                            <w:r>
+                              <w:rPr>
+                                <w:sz w:val="18"/>
+                                <w:szCs w:val="18"/>
+                              </w:rPr>
+                              <w:t xml:space="preserve">7 of 45</w:t>
                             </w:r>
                           </w:p>
                           <w:p>
@@ -657,29 +769,14 @@
                                 <w:sz w:val="18"/>
                                 <w:szCs w:val="18"/>
                               </w:rPr>
-                              <w:t xml:space="preserve">Evidence: </w:t>
+                              <w:t xml:space="preserve">Posts citing evidence or law: </w:t>
                             </w:r>
                             <w:r>
                               <w:rPr>
                                 <w:sz w:val="18"/>
                                 <w:szCs w:val="18"/>
                               </w:rPr>
-                              <w:t xml:space="preserve">only </w:t>
-                            </w:r>
-                            <w:r>
-                              <w:rPr>
-                                <w:sz w:val="18"/>
-                                <w:szCs w:val="18"/>
-                                <w:highlight w:val="yellow"/>
-                              </w:rPr>
-                              <w:t xml:space="preserve">[X of N]</w:t>
-                            </w:r>
-                            <w:r>
-                              <w:rPr>
-                                <w:sz w:val="18"/>
-                                <w:szCs w:val="18"/>
-                              </w:rPr>
-                              <w:t xml:space="preserve"> posts cited a source.</w:t>
+                              <w:t xml:space="preserve">0 of 45</w:t>
                             </w:r>
                           </w:p>
                         </w:txbxContent>
@@ -709,52 +806,7 @@
           <w:sz w:val="20"/>
           <w:szCs w:val="20"/>
         </w:rPr>
-        <w:t xml:space="preserve">Copilot grouped the </w:t>
-      </w:r>
-      <w:r>
-        <w:rPr>
-          <w:sz w:val="20"/>
-          <w:szCs w:val="20"/>
-          <w:highlight w:val="yellow"/>
-        </w:rPr>
-        <w:t xml:space="preserve">[N]</w:t>
-      </w:r>
-      <w:r>
-        <w:rPr>
-          <w:sz w:val="20"/>
-          <w:szCs w:val="20"/>
-        </w:rPr>
-        <w:t xml:space="preserve"> padlet posts [1] into four themes (Figure 1): accessibility for disabled users, bias in data and AI, the digital divide (age, income, location) and diversity in development teams. Accessibility was the most frequent, e.g. “</w:t>
-      </w:r>
-      <w:r>
-        <w:rPr>
-          <w:sz w:val="20"/>
-          <w:szCs w:val="20"/>
-          <w:highlight w:val="yellow"/>
-        </w:rPr>
-        <w:t xml:space="preserve">[direct quote]</w:t>
-      </w:r>
-      <w:r>
-        <w:rPr>
-          <w:sz w:val="20"/>
-          <w:szCs w:val="20"/>
-        </w:rPr>
-        <w:t xml:space="preserve">” [1]. External evidence supports this: WCAG 2.2 sets testable success criteria because many interfaces still exclude disabled users [3]. The bias theme is also well supported – commercial gender classifiers misclassified darker-skinned women up to 34.7% of the time, against 0.8% for lighter-skinned men [4]. However, one post argued “</w:t>
-      </w:r>
-      <w:r>
-        <w:rPr>
-          <w:sz w:val="20"/>
-          <w:szCs w:val="20"/>
-          <w:highlight w:val="yellow"/>
-        </w:rPr>
-        <w:t xml:space="preserve">[contradictory quote]</w:t>
-      </w:r>
-      <w:r>
-        <w:rPr>
-          <w:sz w:val="20"/>
-          <w:szCs w:val="20"/>
-        </w:rPr>
-        <w:t xml:space="preserve">” [1], showing that not every contributor saw inclusion as the developer’s responsibility.</w:t>
+        <w:t xml:space="preserve">The 45 posts [1] fall into five themes (Figure 1). Most dominant are diverse perspectives (11 posts) and reducing bias (10): a diverse team “increases the chance of things being caught during code review” (P26) [1]. External evidence supports this: facial-analysis systems built on unrepresentative data misclassified darker-skinned women up to 34.7% of the time against 0.8% for lighter-skinned men [2], echoing P41’s call for “including different people in datasets” [1]. Business claims (P6, P22) are backed by McKinsey, who found gender-diverse executive teams 39% more likely to outperform financially [3], although this shows correlation, not causation. Contradicting the majority, posts warn diversity helps only “if handled well” (P8) and that “non-diverse teams can fully consider impact” (P35) [1].</w:t>
       </w:r>
     </w:p>
     <w:p>
@@ -776,22 +828,7 @@
           <w:sz w:val="20"/>
           <w:szCs w:val="20"/>
         </w:rPr>
-        <w:t xml:space="preserve">Accessibility posts were over-represented and mostly about visual impairment, while neurodiversity, LGBTQ+ users, non-English speakers and low-bandwidth users were </w:t>
-      </w:r>
-      <w:r>
-        <w:rPr>
-          <w:sz w:val="20"/>
-          <w:szCs w:val="20"/>
-          <w:highlight w:val="yellow"/>
-        </w:rPr>
-        <w:t xml:space="preserve">[rarely / never]</w:t>
-      </w:r>
-      <w:r>
-        <w:rPr>
-          <w:sz w:val="20"/>
-          <w:szCs w:val="20"/>
-        </w:rPr>
-        <w:t xml:space="preserve"> mentioned. Few posts cited evidence, and because contributors were computing students of a similar age, the padlet reflects a narrow viewpoint – arguably the same data gap it criticises [5].</w:t>
+        <w:t xml:space="preserve">Generic “more viewpoints” posts are over-represented, often just “More ideas” (P21). Despite the padlet’s title, impacts on actual people are thin: disability, gender and income each appear once, while older, neurodivergent and LGBTQ+ users never appear. Costs to businesses appear once (P31), and no post cites evidence or law such as the Equality Act 2010 [4]. As contributors were one class of computing students, the padlet itself may lack diversity.</w:t>
       </w:r>
     </w:p>
     <w:p>
@@ -813,7 +850,7 @@
           <w:sz w:val="20"/>
           <w:szCs w:val="20"/>
         </w:rPr>
-        <w:t xml:space="preserve">Copilot was used to theme and visualise the posts [2]. Its first output produced </w:t>
+        <w:t xml:space="preserve">Copilot themed and visualised the posts [5]. As the export splits posts into “Subject” and “Body” with “No data” fillers, we merged these first. Copilot’s first output </w:t>
       </w:r>
       <w:r>
         <w:rPr>
@@ -821,44 +858,14 @@
           <w:szCs w:val="20"/>
           <w:highlight w:val="yellow"/>
         </w:rPr>
-        <w:t xml:space="preserve">[seven]</w:t>
+        <w:t xml:space="preserve">[describe its main error]</w:t>
       </w:r>
       <w:r>
         <w:rPr>
           <w:sz w:val="20"/>
           <w:szCs w:val="20"/>
         </w:rPr>
-        <w:t xml:space="preserve"> overlapping themes, so we re-prompted it to merge them into four and list the posts under each. We then checked every post against the padlet: </w:t>
-      </w:r>
-      <w:r>
-        <w:rPr>
-          <w:sz w:val="20"/>
-          <w:szCs w:val="20"/>
-          <w:highlight w:val="yellow"/>
-        </w:rPr>
-        <w:t xml:space="preserve">[X]</w:t>
-      </w:r>
-      <w:r>
-        <w:rPr>
-          <w:sz w:val="20"/>
-          <w:szCs w:val="20"/>
-        </w:rPr>
-        <w:t xml:space="preserve"> posts were misplaced and </w:t>
-      </w:r>
-      <w:r>
-        <w:rPr>
-          <w:sz w:val="20"/>
-          <w:szCs w:val="20"/>
-          <w:highlight w:val="yellow"/>
-        </w:rPr>
-        <w:t xml:space="preserve">[one theme summary was not in any post]</w:t>
-      </w:r>
-      <w:r>
-        <w:rPr>
-          <w:sz w:val="20"/>
-          <w:szCs w:val="20"/>
-        </w:rPr>
-        <w:t xml:space="preserve">, so these were corrected (Figure 2). As Copilot cannot verify claims, all supporting evidence was sourced independently.</w:t>
+        <w:t xml:space="preserve">, so we re-prompted it and checked all 45 posts manually (Figure 2). All supporting sources were found independently.</w:t>
       </w:r>
     </w:p>
     <w:p>
@@ -880,7 +887,7 @@
           <w:sz w:val="20"/>
           <w:szCs w:val="20"/>
         </w:rPr>
-        <w:t xml:space="preserve">the padlet identifies the major inclusion issues but is narrow in perspective and light on evidence, so it is a useful starting point rather than a complete picture.</w:t>
+        <w:t xml:space="preserve">the padlet explains why diverse teams matter but rarely who is affected, so it is a narrow, largely uncritical starting point.</w:t>
       </w:r>
     </w:p>
     <w:p>
@@ -948,37 +955,23 @@
           <w:sz w:val="19"/>
           <w:szCs w:val="19"/>
         </w:rPr>
-        <w:t xml:space="preserve">[2] Microsoft Copilot, “Thematic grouping and mind map of CO3101 padlet posts,” AI chat, 2026. [Online]. Available: </w:t>
-      </w:r>
-      <w:r>
-        <w:rPr>
+        <w:t xml:space="preserve">[2] J. Buolamwini and T. Gebru, “Gender shades: Intersectional accuracy disparities in commercial gender classification,” in </w:t>
+      </w:r>
+      <w:r>
+        <w:rPr>
+          <w:i/>
+          <w:iCs/>
           <w:sz w:val="19"/>
           <w:szCs w:val="19"/>
-          <w:highlight w:val="yellow"/>
-        </w:rPr>
-        <w:t xml:space="preserve">[shared Copilot chat link]</w:t>
+        </w:rPr>
+        <w:t xml:space="preserve">Proc. 1st Conf. Fairness, Accountability and Transparency</w:t>
       </w:r>
       <w:r>
         <w:rPr>
           <w:sz w:val="19"/>
           <w:szCs w:val="19"/>
         </w:rPr>
-        <w:t xml:space="preserve">. [Accessed: </w:t>
-      </w:r>
-      <w:r>
-        <w:rPr>
-          <w:sz w:val="19"/>
-          <w:szCs w:val="19"/>
-          <w:highlight w:val="yellow"/>
-        </w:rPr>
-        <w:t xml:space="preserve">[dd Mmm. 2026]</w:t>
-      </w:r>
-      <w:r>
-        <w:rPr>
-          <w:sz w:val="19"/>
-          <w:szCs w:val="19"/>
-        </w:rPr>
-        <w:t xml:space="preserve">].</w:t>
+        <w:t xml:space="preserve">, PMLR vol. 81, 2018, pp. 77–91.</w:t>
       </w:r>
     </w:p>
     <w:p>
@@ -991,7 +984,7 @@
           <w:sz w:val="19"/>
           <w:szCs w:val="19"/>
         </w:rPr>
-        <w:t xml:space="preserve">[3] World Wide Web Consortium (W3C), “Web Content Accessibility Guidelines (WCAG) 2.2,” W3C Recommendation, Oct. 2023. [Online]. Available: https://www.w3.org/TR/WCAG22/</w:t>
+        <w:t xml:space="preserve">[3] McKinsey &amp; Company, “Diversity matters even more: The case for holistic impact,” Nov. 2023. [Online]. Available: https://www.mckinsey.com/featured-insights/diversity-and-inclusion/diversity-matters-even-more-the-case-for-holistic-impact</w:t>
       </w:r>
     </w:p>
     <w:p>
@@ -1004,7 +997,7 @@
           <w:sz w:val="19"/>
           <w:szCs w:val="19"/>
         </w:rPr>
-        <w:t xml:space="preserve">[4] J. Buolamwini and T. Gebru, “Gender shades: Intersectional accuracy disparities in commercial gender classification,” in </w:t>
+        <w:t xml:space="preserve">[4] </w:t>
       </w:r>
       <w:r>
         <w:rPr>
@@ -1013,14 +1006,14 @@
           <w:sz w:val="19"/>
           <w:szCs w:val="19"/>
         </w:rPr>
-        <w:t xml:space="preserve">Proc. 1st Conf. Fairness, Accountability and Transparency</w:t>
+        <w:t xml:space="preserve">Equality Act 2010</w:t>
       </w:r>
       <w:r>
         <w:rPr>
           <w:sz w:val="19"/>
           <w:szCs w:val="19"/>
         </w:rPr>
-        <w:t xml:space="preserve">, PMLR vol. 81, 2018, pp. 77–91.</w:t>
+        <w:t xml:space="preserve">, c. 15. London, U.K.: The Stationery Office, 2010. [Online]. Available: https://www.legislation.gov.uk/ukpga/2010/15/contents</w:t>
       </w:r>
     </w:p>
     <w:p>
@@ -1033,23 +1026,37 @@
           <w:sz w:val="19"/>
           <w:szCs w:val="19"/>
         </w:rPr>
-        <w:t xml:space="preserve">[5] C. Criado Perez, </w:t>
-      </w:r>
-      <w:r>
-        <w:rPr>
-          <w:i/>
-          <w:iCs/>
+        <w:t xml:space="preserve">[5] Microsoft Copilot, “Thematic grouping and mind map of CO3101 padlet posts,” AI chat, 2026. [Online]. Available: </w:t>
+      </w:r>
+      <w:r>
+        <w:rPr>
           <w:sz w:val="19"/>
           <w:szCs w:val="19"/>
-        </w:rPr>
-        <w:t xml:space="preserve">Invisible Women: Exposing Data Bias in a World Designed for Men</w:t>
+          <w:highlight w:val="yellow"/>
+        </w:rPr>
+        <w:t xml:space="preserve">[shared Copilot chat link]</w:t>
       </w:r>
       <w:r>
         <w:rPr>
           <w:sz w:val="19"/>
           <w:szCs w:val="19"/>
         </w:rPr>
-        <w:t xml:space="preserve">. London, U.K.: Chatto &amp; Windus, 2019.</w:t>
+        <w:t xml:space="preserve">. [Accessed: </w:t>
+      </w:r>
+      <w:r>
+        <w:rPr>
+          <w:sz w:val="19"/>
+          <w:szCs w:val="19"/>
+          <w:highlight w:val="yellow"/>
+        </w:rPr>
+        <w:t xml:space="preserve">[dd Mmm. 2026]</w:t>
+      </w:r>
+      <w:r>
+        <w:rPr>
+          <w:sz w:val="19"/>
+          <w:szCs w:val="19"/>
+        </w:rPr>
+        <w:t xml:space="preserve">].</w:t>
       </w:r>
     </w:p>
     <w:p>
@@ -1062,7 +1069,7 @@
           <w:sz w:val="19"/>
           <w:szCs w:val="19"/>
         </w:rPr>
-        <w:t xml:space="preserve">[6] Anthropic Claude, “Drafting structure for CO3101 CW1 Question 3,” AI chat, 2026. [Online]. Available: </w:t>
+        <w:t xml:space="preserve">[6] Anthropic Claude, “Analysis of padlet posts and drafting of CO3101 CW1 Question 3,” AI chat, 2026. [Online]. Available: </w:t>
       </w:r>
       <w:r>
         <w:rPr>
@@ -1113,7 +1120,7 @@
           <w:sz w:val="19"/>
           <w:szCs w:val="19"/>
         </w:rPr>
-        <w:t xml:space="preserve">Microsoft Copilot [2] was used to group padlet posts into themes and produce the mind map in Figure 1; every post was manually checked against the padlet and errors were corrected. Claude [6] was used to help draft the structure and wording of this answer; all quotes, figures and claims were checked by the group. </w:t>
+        <w:t xml:space="preserve">Microsoft Copilot [5] was used to group the padlet posts into themes and produce the mind map in Figure 1; every post was checked manually against the padlet and errors were corrected. Claude [6] was used to independently count the posts per theme, suggest supporting sources and help draft the structure and wording of this answer; all quotes, counts and sources were checked by us against the originals. </w:t>
       </w:r>
       <w:r>
         <w:rPr>

</xml_diff>

<commit_message>
Q3: record Copilot's actual first output and the corrections made
Co-Authored-By: Claude Opus 5.5 <noreply@anthropic.com>
Claude-Session: https://claude.ai/code/session_01S9UsWNvmNdPnPBZTsuhRaY
</commit_message>
<xml_diff>
--- a/CO3101-CW1/CW1-Question3.docx
+++ b/CO3101-CW1/CW1-Question3.docx
@@ -429,7 +429,7 @@
                                 <w:sz w:val="19"/>
                                 <w:szCs w:val="19"/>
                               </w:rPr>
-                              <w:t xml:space="preserve">Figure 2: Checking the AI</w:t>
+                              <w:t xml:space="preserve">Figure 2: Checking Copilot</w:t>
                             </w:r>
                           </w:p>
                           <w:p>
@@ -444,7 +444,7 @@
                                 <w:sz w:val="17"/>
                                 <w:szCs w:val="17"/>
                               </w:rPr>
-                              <w:t xml:space="preserve">Theme (posts in our manual check):</w:t>
+                              <w:t xml:space="preserve">Theme: Copilot first → after our check</w:t>
                             </w:r>
                           </w:p>
                           <w:p>
@@ -457,7 +457,7 @@
                                 <w:sz w:val="17"/>
                                 <w:szCs w:val="17"/>
                               </w:rPr>
-                              <w:t xml:space="preserve">• Diverse perspectives &amp; teamwork – 11</w:t>
+                              <w:t xml:space="preserve">• Diverse perspectives – 13 → 12</w:t>
                             </w:r>
                           </w:p>
                           <w:p>
@@ -470,7 +470,7 @@
                                 <w:sz w:val="17"/>
                                 <w:szCs w:val="17"/>
                               </w:rPr>
-                              <w:t xml:space="preserve">• Reducing bias &amp; improving quality – 10</w:t>
+                              <w:t xml:space="preserve">• Accessibility &amp; users – 12 → 11</w:t>
                             </w:r>
                           </w:p>
                           <w:p>
@@ -483,7 +483,7 @@
                                 <w:sz w:val="17"/>
                                 <w:szCs w:val="17"/>
                               </w:rPr>
-                              <w:t xml:space="preserve">• Accessibility &amp; understanding users – 9</w:t>
+                              <w:t xml:space="preserve">• Reducing bias – 12 → 11</w:t>
                             </w:r>
                           </w:p>
                           <w:p>
@@ -496,7 +496,7 @@
                                 <w:sz w:val="17"/>
                                 <w:szCs w:val="17"/>
                               </w:rPr>
-                              <w:t xml:space="preserve">• Business &amp; society – 8</w:t>
+                              <w:t xml:space="preserve">• Business – 2 → 4</w:t>
                             </w:r>
                           </w:p>
                           <w:p>
@@ -509,7 +509,7 @@
                                 <w:sz w:val="17"/>
                                 <w:szCs w:val="17"/>
                               </w:rPr>
-                              <w:t xml:space="preserve">• Limits &amp; conditions – 7</w:t>
+                              <w:t xml:space="preserve">• Limitations – 6 → 7</w:t>
                             </w:r>
                           </w:p>
                           <w:p>
@@ -519,33 +519,19 @@
                             </w:pPr>
                             <w:r>
                               <w:rPr>
+                                <w:b/>
+                                <w:bCs/>
                                 <w:sz w:val="17"/>
                                 <w:szCs w:val="17"/>
                               </w:rPr>
-                              <w:t xml:space="preserve">Copilot’s first count: </w:t>
+                              <w:t xml:space="preserve">Moved: </w:t>
                             </w:r>
                             <w:r>
                               <w:rPr>
                                 <w:sz w:val="17"/>
                                 <w:szCs w:val="17"/>
-                                <w:highlight w:val="yellow"/>
-                              </w:rPr>
-                              <w:t xml:space="preserve">[fill in, e.g. 4 themes, 41 posts]</w:t>
-                            </w:r>
-                            <w:r>
-                              <w:rPr>
-                                <w:sz w:val="17"/>
-                                <w:szCs w:val="17"/>
-                              </w:rPr>
-                              <w:t xml:space="preserve">. Corrections made: </w:t>
-                            </w:r>
-                            <w:r>
-                              <w:rPr>
-                                <w:sz w:val="17"/>
-                                <w:szCs w:val="17"/>
-                                <w:highlight w:val="yellow"/>
-                              </w:rPr>
-                              <w:t xml:space="preserve">[e.g. P8, P31 moved]</w:t>
+                              </w:rPr>
+                              <w:t xml:space="preserve">P8, P43 → Limitations (cautious, not benefits); P22, P31 → Business.</w:t>
                             </w:r>
                           </w:p>
                         </w:txbxContent>
@@ -806,7 +792,7 @@
           <w:sz w:val="20"/>
           <w:szCs w:val="20"/>
         </w:rPr>
-        <w:t xml:space="preserve">The 45 posts [1] fall into five themes (Figure 1). Most dominant are diverse perspectives (11 posts) and reducing bias (10): a diverse team “increases the chance of things being caught during code review” (P26) [1]. External evidence supports this: facial-analysis systems built on unrepresentative data misclassified darker-skinned women up to 34.7% of the time against 0.8% for lighter-skinned men [2], echoing P41’s call for “including different people in datasets” [1]. Business claims (P6, P22) are backed by McKinsey, who found gender-diverse executive teams 39% more likely to outperform financially [3], although this shows correlation, not causation. Contradicting the majority, posts warn diversity helps only “if handled well” (P8) and that “non-diverse teams can fully consider impact” (P35) [1].</w:t>
+        <w:t xml:space="preserve">The 45 posts [1] fall into five themes (Figure 1). Diverse perspectives dominates (12 posts), followed by accessibility and reducing bias (11 each): a diverse team “increases the chance of things being caught during code review” (P26) [1]. External evidence supports this: facial-analysis systems built on unrepresentative data misclassified darker-skinned women up to 34.7% of the time against 0.8% for lighter-skinned men [2], echoing P41’s call for “including different people in datasets” [1]. Business claims (P6, P22) are backed by McKinsey, who found gender-diverse executive teams 39% more likely to outperform financially [3], although this shows correlation, not causation. Contradicting the majority, posts warn diversity helps only “if handled well” (P8) and that “non-diverse teams can fully consider impact” (P35) [1].</w:t>
       </w:r>
     </w:p>
     <w:p>
@@ -850,22 +836,7 @@
           <w:sz w:val="20"/>
           <w:szCs w:val="20"/>
         </w:rPr>
-        <w:t xml:space="preserve">Copilot themed and visualised the posts [5]. As the export splits posts into “Subject” and “Body” with “No data” fillers, we merged these first. Copilot’s first output </w:t>
-      </w:r>
-      <w:r>
-        <w:rPr>
-          <w:sz w:val="20"/>
-          <w:szCs w:val="20"/>
-          <w:highlight w:val="yellow"/>
-        </w:rPr>
-        <w:t xml:space="preserve">[describe its main error]</w:t>
-      </w:r>
-      <w:r>
-        <w:rPr>
-          <w:sz w:val="20"/>
-          <w:szCs w:val="20"/>
-        </w:rPr>
-        <w:t xml:space="preserve">, so we re-prompted it and checked all 45 posts manually (Figure 2). All supporting sources were found independently.</w:t>
+        <w:t xml:space="preserve">Copilot themed and visualised the posts [5]. We first merged the export’s split “Subject”/“Body” fields. Copilot counted all 45 posts correctly but labelled cautious posts P8 and P43 as benefits and left business with two posts, so after checking every post manually we re-prompted it (Figure 2). All supporting sources were found independently.</w:t>
       </w:r>
     </w:p>
     <w:p>
@@ -927,22 +898,7 @@
           <w:sz w:val="19"/>
           <w:szCs w:val="19"/>
         </w:rPr>
-        <w:t xml:space="preserve">[1] J. Hoey, “Inclusive approach to software engineering: The impacts on people, society, businesses,” Padlet, CO3101 Lecture 5, 2026. [Online]. Available: https://padlet.com/jameshoey/cw1q3. [Accessed: </w:t>
-      </w:r>
-      <w:r>
-        <w:rPr>
-          <w:sz w:val="19"/>
-          <w:szCs w:val="19"/>
-          <w:highlight w:val="yellow"/>
-        </w:rPr>
-        <w:t xml:space="preserve">[dd Mmm. 2026]</w:t>
-      </w:r>
-      <w:r>
-        <w:rPr>
-          <w:sz w:val="19"/>
-          <w:szCs w:val="19"/>
-        </w:rPr>
-        <w:t xml:space="preserve">].</w:t>
+        <w:t xml:space="preserve">[1] J. Hoey, “Inclusive approach to software engineering: The impacts on people, society, businesses,” Padlet, CO3101 Lecture 5, 2026. [Online]. Available: https://padlet.com/jameshoey/cw1q3. [Accessed: 29 Oct. 2026].</w:t>
       </w:r>
     </w:p>
     <w:p>
@@ -1041,22 +997,7 @@
           <w:sz w:val="19"/>
           <w:szCs w:val="19"/>
         </w:rPr>
-        <w:t xml:space="preserve">. [Accessed: </w:t>
-      </w:r>
-      <w:r>
-        <w:rPr>
-          <w:sz w:val="19"/>
-          <w:szCs w:val="19"/>
-          <w:highlight w:val="yellow"/>
-        </w:rPr>
-        <w:t xml:space="preserve">[dd Mmm. 2026]</w:t>
-      </w:r>
-      <w:r>
-        <w:rPr>
-          <w:sz w:val="19"/>
-          <w:szCs w:val="19"/>
-        </w:rPr>
-        <w:t xml:space="preserve">].</w:t>
+        <w:t xml:space="preserve">. [Accessed: 29 Oct. 2026].</w:t>
       </w:r>
     </w:p>
     <w:p>
@@ -1084,22 +1025,7 @@
           <w:sz w:val="19"/>
           <w:szCs w:val="19"/>
         </w:rPr>
-        <w:t xml:space="preserve">. [Accessed: </w:t>
-      </w:r>
-      <w:r>
-        <w:rPr>
-          <w:sz w:val="19"/>
-          <w:szCs w:val="19"/>
-          <w:highlight w:val="yellow"/>
-        </w:rPr>
-        <w:t xml:space="preserve">[dd Mmm. 2026]</w:t>
-      </w:r>
-      <w:r>
-        <w:rPr>
-          <w:sz w:val="19"/>
-          <w:szCs w:val="19"/>
-        </w:rPr>
-        <w:t xml:space="preserve">].</w:t>
+        <w:t xml:space="preserve">. [Accessed: 29 Oct. 2026].</w:t>
       </w:r>
     </w:p>
     <w:p>

</xml_diff>

<commit_message>
Q3: add light-theme render of Copilot mind map as Figure 1
Co-Authored-By: Claude Opus 5.5 <noreply@anthropic.com>
Claude-Session: https://claude.ai/code/session_01S9UsWNvmNdPnPBZTsuhRaY
</commit_message>
<xml_diff>
--- a/CO3101-CW1/CW1-Question3.docx
+++ b/CO3101-CW1/CW1-Question3.docx
@@ -195,16 +195,41 @@
                         <w:txbxContent>
                           <w:p>
                             <w:pPr>
-                              <w:spacing w:after="0" w:line="240" w:lineRule="auto"/>
+                              <w:spacing w:after="0"/>
                               <w:jc w:val="center"/>
                             </w:pPr>
                             <w:r>
-                              <w:rPr>
-                                <w:sz w:val="20"/>
-                                <w:szCs w:val="20"/>
-                                <w:highlight w:val="yellow"/>
-                              </w:rPr>
-                              <w:t xml:space="preserve">[INSERT FIGURE 1 HERE: the mind map Copilot produced from the 45 padlet posts, after you have checked and corrected it. Delete this box text and paste the image (Insert &gt; Picture), sized to fill this box]</w:t>
+                              <w:drawing>
+                                <wp:inline distT="0" distB="0" distL="0" distR="0">
+                                  <wp:extent cx="6300000" cy="2510000"/>
+                                  <wp:docPr id="990" name="Figure 1 mind map"/>
+                                  <a:graphic xmlns:a="http://schemas.openxmlformats.org/drawingml/2006/main">
+                                    <a:graphicData uri="http://schemas.openxmlformats.org/drawingml/2006/picture">
+                                      <pic:pic xmlns:pic="http://schemas.openxmlformats.org/drawingml/2006/picture">
+                                        <pic:nvPicPr>
+                                          <pic:cNvPr id="990" name="mindmap.png"/>
+                                          <pic:cNvPicPr/>
+                                        </pic:nvPicPr>
+                                        <pic:blipFill>
+                                          <a:blip r:embed="rIdMindmap"/>
+                                          <a:stretch>
+                                            <a:fillRect/>
+                                          </a:stretch>
+                                        </pic:blipFill>
+                                        <pic:spPr>
+                                          <a:xfrm>
+                                            <a:off x="0" y="0"/>
+                                            <a:ext cx="6300000" cy="2510000"/>
+                                          </a:xfrm>
+                                          <a:prstGeom prst="rect">
+                                            <a:avLst/>
+                                          </a:prstGeom>
+                                        </pic:spPr>
+                                      </pic:pic>
+                                    </a:graphicData>
+                                  </a:graphic>
+                                </wp:inline>
+                              </w:drawing>
                             </w:r>
                           </w:p>
                         </w:txbxContent>
@@ -1046,7 +1071,7 @@
           <w:sz w:val="19"/>
           <w:szCs w:val="19"/>
         </w:rPr>
-        <w:t xml:space="preserve">Microsoft Copilot [5] was used to group the padlet posts into themes and produce the mind map in Figure 1; every post was checked manually against the padlet and errors were corrected. Claude [6] was used to independently count the posts per theme, suggest supporting sources and help draft the structure and wording of this answer; all quotes, counts and sources were checked by us against the originals. </w:t>
+        <w:t xml:space="preserve">Microsoft Copilot [5] was used to group the padlet posts into themes and produce the mind map in Figure 1; every post was checked manually against the padlet and errors were corrected. Claude [6] was used to independently count the posts per theme, re-render Copilot’s unchanged mind-map code in a light theme, suggest supporting sources and help draft the structure and wording of this answer; all quotes, counts and sources were checked by us against the originals. </w:t>
       </w:r>
       <w:r>
         <w:rPr>

</xml_diff>